<commit_message>
added nav bar for notes page and some functionality
</commit_message>
<xml_diff>
--- a/Documents/Product Backlog.docx
+++ b/Documents/Product Backlog.docx
@@ -341,7 +341,15 @@
         </w:numPr>
       </w:pPr>
       <w:r>
-        <w:t xml:space="preserve">Notes previews link to </w:t>
+        <w:t xml:space="preserve">Notes </w:t>
+      </w:r>
+      <w:proofErr w:type="gramStart"/>
+      <w:r>
+        <w:t>previews</w:t>
+      </w:r>
+      <w:proofErr w:type="gramEnd"/>
+      <w:r>
+        <w:t xml:space="preserve"> link to </w:t>
       </w:r>
       <w:r>
         <w:t>the whole note</w:t>
@@ -683,8 +691,13 @@
         <w:t>Store all notes in their own</w:t>
       </w:r>
       <w:r>
-        <w:t xml:space="preserve"> json</w:t>
-      </w:r>
+        <w:t xml:space="preserve"> </w:t>
+      </w:r>
+      <w:proofErr w:type="spellStart"/>
+      <w:r>
+        <w:t>json</w:t>
+      </w:r>
+      <w:proofErr w:type="spellEnd"/>
       <w:r>
         <w:t xml:space="preserve"> file</w:t>
       </w:r>

</xml_diff>

<commit_message>
notes now pin and unpin fully correctly
</commit_message>
<xml_diff>
--- a/Documents/Product Backlog.docx
+++ b/Documents/Product Backlog.docx
@@ -13,8 +13,14 @@
     <w:p>
       <w:pPr>
         <w:pStyle w:val="Heading2"/>
-      </w:pPr>
-      <w:r>
+        <w:rPr>
+          <w:highlight w:val="green"/>
+        </w:rPr>
+      </w:pPr>
+      <w:r>
+        <w:rPr>
+          <w:highlight w:val="green"/>
+        </w:rPr>
         <w:t>Website Infrastructure Setup</w:t>
       </w:r>
     </w:p>
@@ -25,8 +31,14 @@
           <w:ilvl w:val="0"/>
           <w:numId w:val="3"/>
         </w:numPr>
-      </w:pPr>
-      <w:r>
+        <w:rPr>
+          <w:highlight w:val="green"/>
+        </w:rPr>
+      </w:pPr>
+      <w:r>
+        <w:rPr>
+          <w:highlight w:val="green"/>
+        </w:rPr>
         <w:t>User story: As a developer, I want to set up the infrastructure so I can start building the website</w:t>
       </w:r>
     </w:p>
@@ -37,8 +49,14 @@
           <w:ilvl w:val="1"/>
           <w:numId w:val="3"/>
         </w:numPr>
-      </w:pPr>
-      <w:r>
+        <w:rPr>
+          <w:highlight w:val="green"/>
+        </w:rPr>
+      </w:pPr>
+      <w:r>
+        <w:rPr>
+          <w:highlight w:val="green"/>
+        </w:rPr>
         <w:t>Tasks:</w:t>
       </w:r>
     </w:p>
@@ -49,8 +67,14 @@
           <w:ilvl w:val="2"/>
           <w:numId w:val="3"/>
         </w:numPr>
-      </w:pPr>
-      <w:r>
+        <w:rPr>
+          <w:highlight w:val="green"/>
+        </w:rPr>
+      </w:pPr>
+      <w:r>
+        <w:rPr>
+          <w:highlight w:val="green"/>
+        </w:rPr>
         <w:t>Set up repository</w:t>
       </w:r>
     </w:p>
@@ -61,25 +85,46 @@
           <w:ilvl w:val="2"/>
           <w:numId w:val="3"/>
         </w:numPr>
-      </w:pPr>
-      <w:r>
+        <w:rPr>
+          <w:highlight w:val="green"/>
+        </w:rPr>
+      </w:pPr>
+      <w:r>
+        <w:rPr>
+          <w:highlight w:val="green"/>
+        </w:rPr>
         <w:t>Dow</w:t>
       </w:r>
       <w:r>
+        <w:rPr>
+          <w:highlight w:val="green"/>
+        </w:rPr>
         <w:t>n</w:t>
       </w:r>
       <w:r>
+        <w:rPr>
+          <w:highlight w:val="green"/>
+        </w:rPr>
         <w:t>load all needed extensions</w:t>
       </w:r>
     </w:p>
     <w:p>
       <w:pPr>
         <w:pStyle w:val="Heading2"/>
-      </w:pPr>
-      <w:r>
+        <w:rPr>
+          <w:highlight w:val="green"/>
+        </w:rPr>
+      </w:pPr>
+      <w:r>
+        <w:rPr>
+          <w:highlight w:val="green"/>
+        </w:rPr>
         <w:t xml:space="preserve">Layout </w:t>
       </w:r>
       <w:r>
+        <w:rPr>
+          <w:highlight w:val="green"/>
+        </w:rPr>
         <w:t>Design</w:t>
       </w:r>
     </w:p>
@@ -90,8 +135,14 @@
           <w:ilvl w:val="0"/>
           <w:numId w:val="3"/>
         </w:numPr>
-      </w:pPr>
-      <w:r>
+        <w:rPr>
+          <w:highlight w:val="green"/>
+        </w:rPr>
+      </w:pPr>
+      <w:r>
+        <w:rPr>
+          <w:highlight w:val="green"/>
+        </w:rPr>
         <w:t xml:space="preserve">User story: As a user, I want the website to be easy to navigate </w:t>
       </w:r>
     </w:p>
@@ -102,8 +153,14 @@
           <w:ilvl w:val="1"/>
           <w:numId w:val="3"/>
         </w:numPr>
-      </w:pPr>
-      <w:r>
+        <w:rPr>
+          <w:highlight w:val="green"/>
+        </w:rPr>
+      </w:pPr>
+      <w:r>
+        <w:rPr>
+          <w:highlight w:val="green"/>
+        </w:rPr>
         <w:t>Tasks:</w:t>
       </w:r>
     </w:p>
@@ -114,8 +171,14 @@
           <w:ilvl w:val="2"/>
           <w:numId w:val="3"/>
         </w:numPr>
-      </w:pPr>
-      <w:r>
+        <w:rPr>
+          <w:highlight w:val="green"/>
+        </w:rPr>
+      </w:pPr>
+      <w:r>
+        <w:rPr>
+          <w:highlight w:val="green"/>
+        </w:rPr>
         <w:t>Create sitemap</w:t>
       </w:r>
     </w:p>
@@ -126,8 +189,14 @@
           <w:ilvl w:val="2"/>
           <w:numId w:val="3"/>
         </w:numPr>
-      </w:pPr>
-      <w:r>
+        <w:rPr>
+          <w:highlight w:val="green"/>
+        </w:rPr>
+      </w:pPr>
+      <w:r>
+        <w:rPr>
+          <w:highlight w:val="green"/>
+        </w:rPr>
         <w:t xml:space="preserve">Create base wireframe </w:t>
       </w:r>
     </w:p>
@@ -138,16 +207,28 @@
           <w:ilvl w:val="2"/>
           <w:numId w:val="3"/>
         </w:numPr>
-      </w:pPr>
-      <w:r>
+        <w:rPr>
+          <w:highlight w:val="green"/>
+        </w:rPr>
+      </w:pPr>
+      <w:r>
+        <w:rPr>
+          <w:highlight w:val="green"/>
+        </w:rPr>
         <w:t>Create individual ‘page’ wireframes</w:t>
       </w:r>
     </w:p>
     <w:p>
       <w:pPr>
         <w:pStyle w:val="Heading2"/>
-      </w:pPr>
-      <w:r>
+        <w:rPr>
+          <w:highlight w:val="green"/>
+        </w:rPr>
+      </w:pPr>
+      <w:r>
+        <w:rPr>
+          <w:highlight w:val="green"/>
+        </w:rPr>
         <w:t>Architecture</w:t>
       </w:r>
     </w:p>
@@ -158,11 +239,20 @@
           <w:ilvl w:val="0"/>
           <w:numId w:val="3"/>
         </w:numPr>
-      </w:pPr>
-      <w:r>
+        <w:rPr>
+          <w:highlight w:val="green"/>
+        </w:rPr>
+      </w:pPr>
+      <w:r>
+        <w:rPr>
+          <w:highlight w:val="green"/>
+        </w:rPr>
         <w:t xml:space="preserve">User story: As a developer, I want the website to be easy to </w:t>
       </w:r>
       <w:r>
+        <w:rPr>
+          <w:highlight w:val="green"/>
+        </w:rPr>
         <w:t>program and maintain</w:t>
       </w:r>
     </w:p>
@@ -173,8 +263,14 @@
           <w:ilvl w:val="1"/>
           <w:numId w:val="3"/>
         </w:numPr>
-      </w:pPr>
-      <w:r>
+        <w:rPr>
+          <w:highlight w:val="green"/>
+        </w:rPr>
+      </w:pPr>
+      <w:r>
+        <w:rPr>
+          <w:highlight w:val="green"/>
+        </w:rPr>
         <w:t>Tasks:</w:t>
       </w:r>
     </w:p>
@@ -185,8 +281,14 @@
           <w:ilvl w:val="2"/>
           <w:numId w:val="3"/>
         </w:numPr>
-      </w:pPr>
-      <w:r>
+        <w:rPr>
+          <w:highlight w:val="green"/>
+        </w:rPr>
+      </w:pPr>
+      <w:r>
+        <w:rPr>
+          <w:highlight w:val="green"/>
+        </w:rPr>
         <w:t>Create the package diagram</w:t>
       </w:r>
     </w:p>
@@ -197,8 +299,14 @@
           <w:ilvl w:val="2"/>
           <w:numId w:val="3"/>
         </w:numPr>
-      </w:pPr>
-      <w:r>
+        <w:rPr>
+          <w:highlight w:val="green"/>
+        </w:rPr>
+      </w:pPr>
+      <w:r>
+        <w:rPr>
+          <w:highlight w:val="green"/>
+        </w:rPr>
         <w:t>Create class diagrams</w:t>
       </w:r>
     </w:p>
@@ -209,16 +317,28 @@
           <w:ilvl w:val="2"/>
           <w:numId w:val="3"/>
         </w:numPr>
-      </w:pPr>
-      <w:r>
+        <w:rPr>
+          <w:highlight w:val="green"/>
+        </w:rPr>
+      </w:pPr>
+      <w:r>
+        <w:rPr>
+          <w:highlight w:val="green"/>
+        </w:rPr>
         <w:t>Create the sequence diagrams</w:t>
       </w:r>
     </w:p>
     <w:p>
       <w:pPr>
         <w:pStyle w:val="Heading2"/>
-      </w:pPr>
-      <w:r>
+        <w:rPr>
+          <w:highlight w:val="green"/>
+        </w:rPr>
+      </w:pPr>
+      <w:r>
+        <w:rPr>
+          <w:highlight w:val="green"/>
+        </w:rPr>
         <w:t>Login Page</w:t>
       </w:r>
     </w:p>
@@ -229,8 +349,14 @@
           <w:ilvl w:val="0"/>
           <w:numId w:val="3"/>
         </w:numPr>
-      </w:pPr>
-      <w:r>
+        <w:rPr>
+          <w:highlight w:val="green"/>
+        </w:rPr>
+      </w:pPr>
+      <w:r>
+        <w:rPr>
+          <w:highlight w:val="green"/>
+        </w:rPr>
         <w:t>User story: As a user, I want my notes to be kept secure behind a login page</w:t>
       </w:r>
     </w:p>
@@ -241,8 +367,14 @@
           <w:ilvl w:val="1"/>
           <w:numId w:val="3"/>
         </w:numPr>
-      </w:pPr>
-      <w:r>
+        <w:rPr>
+          <w:highlight w:val="green"/>
+        </w:rPr>
+      </w:pPr>
+      <w:r>
+        <w:rPr>
+          <w:highlight w:val="green"/>
+        </w:rPr>
         <w:t>Tasks:</w:t>
       </w:r>
     </w:p>
@@ -253,11 +385,20 @@
           <w:ilvl w:val="2"/>
           <w:numId w:val="3"/>
         </w:numPr>
-      </w:pPr>
-      <w:r>
+        <w:rPr>
+          <w:highlight w:val="green"/>
+        </w:rPr>
+      </w:pPr>
+      <w:r>
+        <w:rPr>
+          <w:highlight w:val="green"/>
+        </w:rPr>
         <w:t>Design and implement a login page, that after a successful login, opens</w:t>
       </w:r>
       <w:r>
+        <w:rPr>
+          <w:highlight w:val="green"/>
+        </w:rPr>
         <w:t xml:space="preserve"> to the home page</w:t>
       </w:r>
     </w:p>
@@ -268,16 +409,28 @@
           <w:ilvl w:val="2"/>
           <w:numId w:val="3"/>
         </w:numPr>
-      </w:pPr>
-      <w:r>
+        <w:rPr>
+          <w:highlight w:val="green"/>
+        </w:rPr>
+      </w:pPr>
+      <w:r>
+        <w:rPr>
+          <w:highlight w:val="green"/>
+        </w:rPr>
         <w:t>Securely hash and store the password</w:t>
       </w:r>
     </w:p>
     <w:p>
       <w:pPr>
         <w:pStyle w:val="Heading2"/>
-      </w:pPr>
-      <w:r>
+        <w:rPr>
+          <w:highlight w:val="green"/>
+        </w:rPr>
+      </w:pPr>
+      <w:r>
+        <w:rPr>
+          <w:highlight w:val="green"/>
+        </w:rPr>
         <w:t>Home Page</w:t>
       </w:r>
     </w:p>
@@ -288,11 +441,20 @@
           <w:ilvl w:val="0"/>
           <w:numId w:val="3"/>
         </w:numPr>
-      </w:pPr>
-      <w:r>
+        <w:rPr>
+          <w:highlight w:val="green"/>
+        </w:rPr>
+      </w:pPr>
+      <w:r>
+        <w:rPr>
+          <w:highlight w:val="green"/>
+        </w:rPr>
         <w:t>User story: As a user, I want to be able to easily see all my notes and access</w:t>
       </w:r>
       <w:r>
+        <w:rPr>
+          <w:highlight w:val="green"/>
+        </w:rPr>
         <w:t xml:space="preserve"> them</w:t>
       </w:r>
     </w:p>
@@ -303,8 +465,14 @@
           <w:ilvl w:val="1"/>
           <w:numId w:val="3"/>
         </w:numPr>
-      </w:pPr>
-      <w:r>
+        <w:rPr>
+          <w:highlight w:val="green"/>
+        </w:rPr>
+      </w:pPr>
+      <w:r>
+        <w:rPr>
+          <w:highlight w:val="green"/>
+        </w:rPr>
         <w:t>Tasks:</w:t>
       </w:r>
     </w:p>
@@ -315,8 +483,14 @@
           <w:ilvl w:val="2"/>
           <w:numId w:val="3"/>
         </w:numPr>
-      </w:pPr>
-      <w:r>
+        <w:rPr>
+          <w:highlight w:val="green"/>
+        </w:rPr>
+      </w:pPr>
+      <w:r>
+        <w:rPr>
+          <w:highlight w:val="green"/>
+        </w:rPr>
         <w:t>Design and implement layout</w:t>
       </w:r>
     </w:p>
@@ -362,16 +536,28 @@
           <w:ilvl w:val="2"/>
           <w:numId w:val="3"/>
         </w:numPr>
-      </w:pPr>
-      <w:r>
+        <w:rPr>
+          <w:highlight w:val="green"/>
+        </w:rPr>
+      </w:pPr>
+      <w:r>
+        <w:rPr>
+          <w:highlight w:val="green"/>
+        </w:rPr>
         <w:t>Add a button to create a new note</w:t>
       </w:r>
     </w:p>
     <w:p>
       <w:pPr>
         <w:pStyle w:val="Heading2"/>
-      </w:pPr>
-      <w:r>
+        <w:rPr>
+          <w:highlight w:val="green"/>
+        </w:rPr>
+      </w:pPr>
+      <w:r>
+        <w:rPr>
+          <w:highlight w:val="green"/>
+        </w:rPr>
         <w:t>Note Page</w:t>
       </w:r>
     </w:p>
@@ -382,8 +568,14 @@
           <w:ilvl w:val="0"/>
           <w:numId w:val="3"/>
         </w:numPr>
-      </w:pPr>
-      <w:r>
+        <w:rPr>
+          <w:highlight w:val="green"/>
+        </w:rPr>
+      </w:pPr>
+      <w:r>
+        <w:rPr>
+          <w:highlight w:val="green"/>
+        </w:rPr>
         <w:t xml:space="preserve">User story: As a user, I want to be able to edit my notes and clear them </w:t>
       </w:r>
     </w:p>
@@ -394,8 +586,14 @@
           <w:ilvl w:val="1"/>
           <w:numId w:val="3"/>
         </w:numPr>
-      </w:pPr>
-      <w:r>
+        <w:rPr>
+          <w:highlight w:val="green"/>
+        </w:rPr>
+      </w:pPr>
+      <w:r>
+        <w:rPr>
+          <w:highlight w:val="green"/>
+        </w:rPr>
         <w:t>Tasks:</w:t>
       </w:r>
     </w:p>
@@ -406,8 +604,14 @@
           <w:ilvl w:val="2"/>
           <w:numId w:val="3"/>
         </w:numPr>
-      </w:pPr>
-      <w:r>
+        <w:rPr>
+          <w:highlight w:val="green"/>
+        </w:rPr>
+      </w:pPr>
+      <w:r>
+        <w:rPr>
+          <w:highlight w:val="green"/>
+        </w:rPr>
         <w:t>Design and implement note layout</w:t>
       </w:r>
     </w:p>
@@ -423,6 +627,9 @@
         <w:t xml:space="preserve">Add buttons (delete, clear and </w:t>
       </w:r>
       <w:r>
+        <w:rPr>
+          <w:highlight w:val="green"/>
+        </w:rPr>
         <w:t>save)</w:t>
       </w:r>
     </w:p>
@@ -453,9 +660,33 @@
     </w:p>
     <w:p>
       <w:pPr>
+        <w:pStyle w:val="ListParagraph"/>
+        <w:numPr>
+          <w:ilvl w:val="2"/>
+          <w:numId w:val="3"/>
+        </w:numPr>
+        <w:rPr>
+          <w:highlight w:val="green"/>
+        </w:rPr>
+      </w:pPr>
+      <w:r>
+        <w:rPr>
+          <w:highlight w:val="green"/>
+        </w:rPr>
+        <w:t>Add button to pin notes</w:t>
+      </w:r>
+    </w:p>
+    <w:p>
+      <w:pPr>
         <w:pStyle w:val="Heading2"/>
-      </w:pPr>
-      <w:r>
+        <w:rPr>
+          <w:highlight w:val="green"/>
+        </w:rPr>
+      </w:pPr>
+      <w:r>
+        <w:rPr>
+          <w:highlight w:val="green"/>
+        </w:rPr>
         <w:t>Settings Page</w:t>
       </w:r>
     </w:p>
@@ -466,11 +697,20 @@
           <w:ilvl w:val="0"/>
           <w:numId w:val="3"/>
         </w:numPr>
-      </w:pPr>
-      <w:r>
+        <w:rPr>
+          <w:highlight w:val="green"/>
+        </w:rPr>
+      </w:pPr>
+      <w:r>
+        <w:rPr>
+          <w:highlight w:val="green"/>
+        </w:rPr>
         <w:t xml:space="preserve">User story: As a user, I want to be able to </w:t>
       </w:r>
       <w:r>
+        <w:rPr>
+          <w:highlight w:val="green"/>
+        </w:rPr>
         <w:t>modify the design of the website to my liking</w:t>
       </w:r>
     </w:p>
@@ -481,8 +721,14 @@
           <w:ilvl w:val="1"/>
           <w:numId w:val="3"/>
         </w:numPr>
-      </w:pPr>
-      <w:r>
+        <w:rPr>
+          <w:highlight w:val="green"/>
+        </w:rPr>
+      </w:pPr>
+      <w:r>
+        <w:rPr>
+          <w:highlight w:val="green"/>
+        </w:rPr>
         <w:t>Tasks:</w:t>
       </w:r>
     </w:p>
@@ -493,8 +739,14 @@
           <w:ilvl w:val="2"/>
           <w:numId w:val="3"/>
         </w:numPr>
-      </w:pPr>
-      <w:r>
+        <w:rPr>
+          <w:highlight w:val="green"/>
+        </w:rPr>
+      </w:pPr>
+      <w:r>
+        <w:rPr>
+          <w:highlight w:val="green"/>
+        </w:rPr>
         <w:t>Implement the layout of the page</w:t>
       </w:r>
     </w:p>
@@ -505,11 +757,20 @@
           <w:ilvl w:val="2"/>
           <w:numId w:val="3"/>
         </w:numPr>
-      </w:pPr>
-      <w:r>
+        <w:rPr>
+          <w:highlight w:val="green"/>
+        </w:rPr>
+      </w:pPr>
+      <w:r>
+        <w:rPr>
+          <w:highlight w:val="green"/>
+        </w:rPr>
         <w:t>Add buttons to change the design (theme, font size</w:t>
       </w:r>
       <w:r>
+        <w:rPr>
+          <w:highlight w:val="green"/>
+        </w:rPr>
         <w:t>)</w:t>
       </w:r>
     </w:p>
@@ -520,8 +781,14 @@
           <w:ilvl w:val="2"/>
           <w:numId w:val="3"/>
         </w:numPr>
-      </w:pPr>
-      <w:r>
+        <w:rPr>
+          <w:highlight w:val="green"/>
+        </w:rPr>
+      </w:pPr>
+      <w:r>
+        <w:rPr>
+          <w:highlight w:val="green"/>
+        </w:rPr>
         <w:t>Add button to log out</w:t>
       </w:r>
     </w:p>

</xml_diff>

<commit_message>
started creating and saving to a json flat file
</commit_message>
<xml_diff>
--- a/Documents/Product Backlog.docx
+++ b/Documents/Product Backlog.docx
@@ -13,14 +13,8 @@
     <w:p>
       <w:pPr>
         <w:pStyle w:val="Heading2"/>
-        <w:rPr>
-          <w:highlight w:val="green"/>
-        </w:rPr>
-      </w:pPr>
-      <w:r>
-        <w:rPr>
-          <w:highlight w:val="green"/>
-        </w:rPr>
+      </w:pPr>
+      <w:r>
         <w:t>Website Infrastructure Setup</w:t>
       </w:r>
     </w:p>
@@ -31,14 +25,8 @@
           <w:ilvl w:val="0"/>
           <w:numId w:val="3"/>
         </w:numPr>
-        <w:rPr>
-          <w:highlight w:val="green"/>
-        </w:rPr>
-      </w:pPr>
-      <w:r>
-        <w:rPr>
-          <w:highlight w:val="green"/>
-        </w:rPr>
+      </w:pPr>
+      <w:r>
         <w:t>User story: As a developer, I want to set up the infrastructure so I can start building the website</w:t>
       </w:r>
     </w:p>
@@ -49,14 +37,8 @@
           <w:ilvl w:val="1"/>
           <w:numId w:val="3"/>
         </w:numPr>
-        <w:rPr>
-          <w:highlight w:val="green"/>
-        </w:rPr>
-      </w:pPr>
-      <w:r>
-        <w:rPr>
-          <w:highlight w:val="green"/>
-        </w:rPr>
+      </w:pPr>
+      <w:r>
         <w:t>Tasks:</w:t>
       </w:r>
     </w:p>
@@ -67,14 +49,8 @@
           <w:ilvl w:val="2"/>
           <w:numId w:val="3"/>
         </w:numPr>
-        <w:rPr>
-          <w:highlight w:val="green"/>
-        </w:rPr>
-      </w:pPr>
-      <w:r>
-        <w:rPr>
-          <w:highlight w:val="green"/>
-        </w:rPr>
+      </w:pPr>
+      <w:r>
         <w:t>Set up repository</w:t>
       </w:r>
     </w:p>
@@ -85,46 +61,25 @@
           <w:ilvl w:val="2"/>
           <w:numId w:val="3"/>
         </w:numPr>
-        <w:rPr>
-          <w:highlight w:val="green"/>
-        </w:rPr>
-      </w:pPr>
-      <w:r>
-        <w:rPr>
-          <w:highlight w:val="green"/>
-        </w:rPr>
+      </w:pPr>
+      <w:r>
         <w:t>Dow</w:t>
       </w:r>
       <w:r>
-        <w:rPr>
-          <w:highlight w:val="green"/>
-        </w:rPr>
         <w:t>n</w:t>
       </w:r>
       <w:r>
-        <w:rPr>
-          <w:highlight w:val="green"/>
-        </w:rPr>
         <w:t>load all needed extensions</w:t>
       </w:r>
     </w:p>
     <w:p>
       <w:pPr>
         <w:pStyle w:val="Heading2"/>
-        <w:rPr>
-          <w:highlight w:val="green"/>
-        </w:rPr>
-      </w:pPr>
-      <w:r>
-        <w:rPr>
-          <w:highlight w:val="green"/>
-        </w:rPr>
+      </w:pPr>
+      <w:r>
         <w:t xml:space="preserve">Layout </w:t>
       </w:r>
       <w:r>
-        <w:rPr>
-          <w:highlight w:val="green"/>
-        </w:rPr>
         <w:t>Design</w:t>
       </w:r>
     </w:p>
@@ -135,14 +90,8 @@
           <w:ilvl w:val="0"/>
           <w:numId w:val="3"/>
         </w:numPr>
-        <w:rPr>
-          <w:highlight w:val="green"/>
-        </w:rPr>
-      </w:pPr>
-      <w:r>
-        <w:rPr>
-          <w:highlight w:val="green"/>
-        </w:rPr>
+      </w:pPr>
+      <w:r>
         <w:t xml:space="preserve">User story: As a user, I want the website to be easy to navigate </w:t>
       </w:r>
     </w:p>
@@ -153,14 +102,8 @@
           <w:ilvl w:val="1"/>
           <w:numId w:val="3"/>
         </w:numPr>
-        <w:rPr>
-          <w:highlight w:val="green"/>
-        </w:rPr>
-      </w:pPr>
-      <w:r>
-        <w:rPr>
-          <w:highlight w:val="green"/>
-        </w:rPr>
+      </w:pPr>
+      <w:r>
         <w:t>Tasks:</w:t>
       </w:r>
     </w:p>
@@ -171,14 +114,8 @@
           <w:ilvl w:val="2"/>
           <w:numId w:val="3"/>
         </w:numPr>
-        <w:rPr>
-          <w:highlight w:val="green"/>
-        </w:rPr>
-      </w:pPr>
-      <w:r>
-        <w:rPr>
-          <w:highlight w:val="green"/>
-        </w:rPr>
+      </w:pPr>
+      <w:r>
         <w:t>Create sitemap</w:t>
       </w:r>
     </w:p>
@@ -189,14 +126,8 @@
           <w:ilvl w:val="2"/>
           <w:numId w:val="3"/>
         </w:numPr>
-        <w:rPr>
-          <w:highlight w:val="green"/>
-        </w:rPr>
-      </w:pPr>
-      <w:r>
-        <w:rPr>
-          <w:highlight w:val="green"/>
-        </w:rPr>
+      </w:pPr>
+      <w:r>
         <w:t xml:space="preserve">Create base wireframe </w:t>
       </w:r>
     </w:p>
@@ -207,28 +138,16 @@
           <w:ilvl w:val="2"/>
           <w:numId w:val="3"/>
         </w:numPr>
-        <w:rPr>
-          <w:highlight w:val="green"/>
-        </w:rPr>
-      </w:pPr>
-      <w:r>
-        <w:rPr>
-          <w:highlight w:val="green"/>
-        </w:rPr>
+      </w:pPr>
+      <w:r>
         <w:t>Create individual ‘page’ wireframes</w:t>
       </w:r>
     </w:p>
     <w:p>
       <w:pPr>
         <w:pStyle w:val="Heading2"/>
-        <w:rPr>
-          <w:highlight w:val="green"/>
-        </w:rPr>
-      </w:pPr>
-      <w:r>
-        <w:rPr>
-          <w:highlight w:val="green"/>
-        </w:rPr>
+      </w:pPr>
+      <w:r>
         <w:t>Architecture</w:t>
       </w:r>
     </w:p>
@@ -239,20 +158,11 @@
           <w:ilvl w:val="0"/>
           <w:numId w:val="3"/>
         </w:numPr>
-        <w:rPr>
-          <w:highlight w:val="green"/>
-        </w:rPr>
-      </w:pPr>
-      <w:r>
-        <w:rPr>
-          <w:highlight w:val="green"/>
-        </w:rPr>
+      </w:pPr>
+      <w:r>
         <w:t xml:space="preserve">User story: As a developer, I want the website to be easy to </w:t>
       </w:r>
       <w:r>
-        <w:rPr>
-          <w:highlight w:val="green"/>
-        </w:rPr>
         <w:t>program and maintain</w:t>
       </w:r>
     </w:p>
@@ -263,14 +173,8 @@
           <w:ilvl w:val="1"/>
           <w:numId w:val="3"/>
         </w:numPr>
-        <w:rPr>
-          <w:highlight w:val="green"/>
-        </w:rPr>
-      </w:pPr>
-      <w:r>
-        <w:rPr>
-          <w:highlight w:val="green"/>
-        </w:rPr>
+      </w:pPr>
+      <w:r>
         <w:t>Tasks:</w:t>
       </w:r>
     </w:p>
@@ -281,14 +185,8 @@
           <w:ilvl w:val="2"/>
           <w:numId w:val="3"/>
         </w:numPr>
-        <w:rPr>
-          <w:highlight w:val="green"/>
-        </w:rPr>
-      </w:pPr>
-      <w:r>
-        <w:rPr>
-          <w:highlight w:val="green"/>
-        </w:rPr>
+      </w:pPr>
+      <w:r>
         <w:t>Create the package diagram</w:t>
       </w:r>
     </w:p>
@@ -299,14 +197,8 @@
           <w:ilvl w:val="2"/>
           <w:numId w:val="3"/>
         </w:numPr>
-        <w:rPr>
-          <w:highlight w:val="green"/>
-        </w:rPr>
-      </w:pPr>
-      <w:r>
-        <w:rPr>
-          <w:highlight w:val="green"/>
-        </w:rPr>
+      </w:pPr>
+      <w:r>
         <w:t>Create class diagrams</w:t>
       </w:r>
     </w:p>
@@ -317,28 +209,16 @@
           <w:ilvl w:val="2"/>
           <w:numId w:val="3"/>
         </w:numPr>
-        <w:rPr>
-          <w:highlight w:val="green"/>
-        </w:rPr>
-      </w:pPr>
-      <w:r>
-        <w:rPr>
-          <w:highlight w:val="green"/>
-        </w:rPr>
+      </w:pPr>
+      <w:r>
         <w:t>Create the sequence diagrams</w:t>
       </w:r>
     </w:p>
     <w:p>
       <w:pPr>
         <w:pStyle w:val="Heading2"/>
-        <w:rPr>
-          <w:highlight w:val="green"/>
-        </w:rPr>
-      </w:pPr>
-      <w:r>
-        <w:rPr>
-          <w:highlight w:val="green"/>
-        </w:rPr>
+      </w:pPr>
+      <w:r>
         <w:t>Login Page</w:t>
       </w:r>
     </w:p>
@@ -349,14 +229,8 @@
           <w:ilvl w:val="0"/>
           <w:numId w:val="3"/>
         </w:numPr>
-        <w:rPr>
-          <w:highlight w:val="green"/>
-        </w:rPr>
-      </w:pPr>
-      <w:r>
-        <w:rPr>
-          <w:highlight w:val="green"/>
-        </w:rPr>
+      </w:pPr>
+      <w:r>
         <w:t>User story: As a user, I want my notes to be kept secure behind a login page</w:t>
       </w:r>
     </w:p>
@@ -367,14 +241,8 @@
           <w:ilvl w:val="1"/>
           <w:numId w:val="3"/>
         </w:numPr>
-        <w:rPr>
-          <w:highlight w:val="green"/>
-        </w:rPr>
-      </w:pPr>
-      <w:r>
-        <w:rPr>
-          <w:highlight w:val="green"/>
-        </w:rPr>
+      </w:pPr>
+      <w:r>
         <w:t>Tasks:</w:t>
       </w:r>
     </w:p>
@@ -385,20 +253,11 @@
           <w:ilvl w:val="2"/>
           <w:numId w:val="3"/>
         </w:numPr>
-        <w:rPr>
-          <w:highlight w:val="green"/>
-        </w:rPr>
-      </w:pPr>
-      <w:r>
-        <w:rPr>
-          <w:highlight w:val="green"/>
-        </w:rPr>
+      </w:pPr>
+      <w:r>
         <w:t>Design and implement a login page, that after a successful login, opens</w:t>
       </w:r>
       <w:r>
-        <w:rPr>
-          <w:highlight w:val="green"/>
-        </w:rPr>
         <w:t xml:space="preserve"> to the home page</w:t>
       </w:r>
     </w:p>
@@ -409,28 +268,16 @@
           <w:ilvl w:val="2"/>
           <w:numId w:val="3"/>
         </w:numPr>
-        <w:rPr>
-          <w:highlight w:val="green"/>
-        </w:rPr>
-      </w:pPr>
-      <w:r>
-        <w:rPr>
-          <w:highlight w:val="green"/>
-        </w:rPr>
+      </w:pPr>
+      <w:r>
         <w:t>Securely hash and store the password</w:t>
       </w:r>
     </w:p>
     <w:p>
       <w:pPr>
         <w:pStyle w:val="Heading2"/>
-        <w:rPr>
-          <w:highlight w:val="green"/>
-        </w:rPr>
-      </w:pPr>
-      <w:r>
-        <w:rPr>
-          <w:highlight w:val="green"/>
-        </w:rPr>
+      </w:pPr>
+      <w:r>
         <w:t>Home Page</w:t>
       </w:r>
     </w:p>
@@ -441,20 +288,11 @@
           <w:ilvl w:val="0"/>
           <w:numId w:val="3"/>
         </w:numPr>
-        <w:rPr>
-          <w:highlight w:val="green"/>
-        </w:rPr>
-      </w:pPr>
-      <w:r>
-        <w:rPr>
-          <w:highlight w:val="green"/>
-        </w:rPr>
+      </w:pPr>
+      <w:r>
         <w:t>User story: As a user, I want to be able to easily see all my notes and access</w:t>
       </w:r>
       <w:r>
-        <w:rPr>
-          <w:highlight w:val="green"/>
-        </w:rPr>
         <w:t xml:space="preserve"> them</w:t>
       </w:r>
     </w:p>
@@ -465,14 +303,8 @@
           <w:ilvl w:val="1"/>
           <w:numId w:val="3"/>
         </w:numPr>
-        <w:rPr>
-          <w:highlight w:val="green"/>
-        </w:rPr>
-      </w:pPr>
-      <w:r>
-        <w:rPr>
-          <w:highlight w:val="green"/>
-        </w:rPr>
+      </w:pPr>
+      <w:r>
         <w:t>Tasks:</w:t>
       </w:r>
     </w:p>
@@ -483,14 +315,8 @@
           <w:ilvl w:val="2"/>
           <w:numId w:val="3"/>
         </w:numPr>
-        <w:rPr>
-          <w:highlight w:val="green"/>
-        </w:rPr>
-      </w:pPr>
-      <w:r>
-        <w:rPr>
-          <w:highlight w:val="green"/>
-        </w:rPr>
+      </w:pPr>
+      <w:r>
         <w:t>Design and implement layout</w:t>
       </w:r>
     </w:p>
@@ -536,28 +362,16 @@
           <w:ilvl w:val="2"/>
           <w:numId w:val="3"/>
         </w:numPr>
-        <w:rPr>
-          <w:highlight w:val="green"/>
-        </w:rPr>
-      </w:pPr>
-      <w:r>
-        <w:rPr>
-          <w:highlight w:val="green"/>
-        </w:rPr>
+      </w:pPr>
+      <w:r>
         <w:t>Add a button to create a new note</w:t>
       </w:r>
     </w:p>
     <w:p>
       <w:pPr>
         <w:pStyle w:val="Heading2"/>
-        <w:rPr>
-          <w:highlight w:val="green"/>
-        </w:rPr>
-      </w:pPr>
-      <w:r>
-        <w:rPr>
-          <w:highlight w:val="green"/>
-        </w:rPr>
+      </w:pPr>
+      <w:r>
         <w:t>Note Page</w:t>
       </w:r>
     </w:p>
@@ -568,14 +382,8 @@
           <w:ilvl w:val="0"/>
           <w:numId w:val="3"/>
         </w:numPr>
-        <w:rPr>
-          <w:highlight w:val="green"/>
-        </w:rPr>
-      </w:pPr>
-      <w:r>
-        <w:rPr>
-          <w:highlight w:val="green"/>
-        </w:rPr>
+      </w:pPr>
+      <w:r>
         <w:t xml:space="preserve">User story: As a user, I want to be able to edit my notes and clear them </w:t>
       </w:r>
     </w:p>
@@ -586,14 +394,8 @@
           <w:ilvl w:val="1"/>
           <w:numId w:val="3"/>
         </w:numPr>
-        <w:rPr>
-          <w:highlight w:val="green"/>
-        </w:rPr>
-      </w:pPr>
-      <w:r>
-        <w:rPr>
-          <w:highlight w:val="green"/>
-        </w:rPr>
+      </w:pPr>
+      <w:r>
         <w:t>Tasks:</w:t>
       </w:r>
     </w:p>
@@ -604,14 +406,8 @@
           <w:ilvl w:val="2"/>
           <w:numId w:val="3"/>
         </w:numPr>
-        <w:rPr>
-          <w:highlight w:val="green"/>
-        </w:rPr>
-      </w:pPr>
-      <w:r>
-        <w:rPr>
-          <w:highlight w:val="green"/>
-        </w:rPr>
+      </w:pPr>
+      <w:r>
         <w:t>Design and implement note layout</w:t>
       </w:r>
     </w:p>
@@ -627,9 +423,6 @@
         <w:t xml:space="preserve">Add buttons (delete, clear and </w:t>
       </w:r>
       <w:r>
-        <w:rPr>
-          <w:highlight w:val="green"/>
-        </w:rPr>
         <w:t>save)</w:t>
       </w:r>
     </w:p>
@@ -665,28 +458,16 @@
           <w:ilvl w:val="2"/>
           <w:numId w:val="3"/>
         </w:numPr>
-        <w:rPr>
-          <w:highlight w:val="green"/>
-        </w:rPr>
-      </w:pPr>
-      <w:r>
-        <w:rPr>
-          <w:highlight w:val="green"/>
-        </w:rPr>
+      </w:pPr>
+      <w:r>
         <w:t>Add button to pin notes</w:t>
       </w:r>
     </w:p>
     <w:p>
       <w:pPr>
         <w:pStyle w:val="Heading2"/>
-        <w:rPr>
-          <w:highlight w:val="green"/>
-        </w:rPr>
-      </w:pPr>
-      <w:r>
-        <w:rPr>
-          <w:highlight w:val="green"/>
-        </w:rPr>
+      </w:pPr>
+      <w:r>
         <w:t>Settings Page</w:t>
       </w:r>
     </w:p>
@@ -697,20 +478,11 @@
           <w:ilvl w:val="0"/>
           <w:numId w:val="3"/>
         </w:numPr>
-        <w:rPr>
-          <w:highlight w:val="green"/>
-        </w:rPr>
-      </w:pPr>
-      <w:r>
-        <w:rPr>
-          <w:highlight w:val="green"/>
-        </w:rPr>
+      </w:pPr>
+      <w:r>
         <w:t xml:space="preserve">User story: As a user, I want to be able to </w:t>
       </w:r>
       <w:r>
-        <w:rPr>
-          <w:highlight w:val="green"/>
-        </w:rPr>
         <w:t>modify the design of the website to my liking</w:t>
       </w:r>
     </w:p>
@@ -721,14 +493,8 @@
           <w:ilvl w:val="1"/>
           <w:numId w:val="3"/>
         </w:numPr>
-        <w:rPr>
-          <w:highlight w:val="green"/>
-        </w:rPr>
-      </w:pPr>
-      <w:r>
-        <w:rPr>
-          <w:highlight w:val="green"/>
-        </w:rPr>
+      </w:pPr>
+      <w:r>
         <w:t>Tasks:</w:t>
       </w:r>
     </w:p>
@@ -739,14 +505,8 @@
           <w:ilvl w:val="2"/>
           <w:numId w:val="3"/>
         </w:numPr>
-        <w:rPr>
-          <w:highlight w:val="green"/>
-        </w:rPr>
-      </w:pPr>
-      <w:r>
-        <w:rPr>
-          <w:highlight w:val="green"/>
-        </w:rPr>
+      </w:pPr>
+      <w:r>
         <w:t>Implement the layout of the page</w:t>
       </w:r>
     </w:p>
@@ -757,20 +517,11 @@
           <w:ilvl w:val="2"/>
           <w:numId w:val="3"/>
         </w:numPr>
-        <w:rPr>
-          <w:highlight w:val="green"/>
-        </w:rPr>
-      </w:pPr>
-      <w:r>
-        <w:rPr>
-          <w:highlight w:val="green"/>
-        </w:rPr>
+      </w:pPr>
+      <w:r>
         <w:t>Add buttons to change the design (theme, font size</w:t>
       </w:r>
       <w:r>
-        <w:rPr>
-          <w:highlight w:val="green"/>
-        </w:rPr>
         <w:t>)</w:t>
       </w:r>
     </w:p>
@@ -781,14 +532,8 @@
           <w:ilvl w:val="2"/>
           <w:numId w:val="3"/>
         </w:numPr>
-        <w:rPr>
-          <w:highlight w:val="green"/>
-        </w:rPr>
-      </w:pPr>
-      <w:r>
-        <w:rPr>
-          <w:highlight w:val="green"/>
-        </w:rPr>
+      </w:pPr>
+      <w:r>
         <w:t>Add button to log out</w:t>
       </w:r>
     </w:p>

</xml_diff>